<commit_message>
fix(2a loja): corrige bug que derrubava a 2a loja quando so tinha mensalidade (guard ignorava segMens) + gera UM contrato combinado com as 2 lojas (clausula SEGUNDA UNIDADE condicional nos 4 modelos .docx) mantendo os 2 registros no CRM pra comissao/MRR baterem
</commit_message>
<xml_diff>
--- a/assets/contratos/contrato-elite.docx
+++ b/assets/contratos/contrato-elite.docx
@@ -115,6 +115,11 @@
           <w:szCs w:val="22"/>
         </w:rPr>
         <w:t xml:space="preserve">.</w:t>
+      </w:r>
+    </w:p>
+    <w:p>
+      <w:r>
+        <w:t xml:space="preserve">{#temSegundaLoja}SEGUNDA UNIDADE: O presente contrato abrange também a 2ª unidade da CONTRATANTE, {nome_cliente_2}, pessoa jurídica de direito privado, inscrita no CNPJ nº {cnpj_cliente_2}, pela qual será devido {forma_pagamento_2}{/temSegundaLoja}</w:t>
       </w:r>
     </w:p>
     <w:p>

</xml_diff>

<commit_message>
feat(contrato): opcao CPF ou CNPJ na geracao — seletor no form (1a e 2a loja), formata CPF/CNPJ, e templates usam {doc_tipo}/{qualif_cliente} (pessoa fisica x juridica). CNPJ da Audens intacto
</commit_message>
<xml_diff>
--- a/assets/contratos/contrato-elite.docx
+++ b/assets/contratos/contrato-elite.docx
@@ -96,7 +96,7 @@
           <w:sz w:val="22"/>
           <w:szCs w:val="22"/>
         </w:rPr>
-        <w:t xml:space="preserve">{nome_cliente}, pessoa jurídica de direito privado, inscrita no CNPJ nº {cnpj_cliente}, doravante denominada </w:t>
+        <w:t xml:space="preserve">{nome_cliente}, {qualif_cliente}, inscrita no {doc_tipo} nº {cnpj_cliente}, doravante denominada </w:t>
       </w:r>
       <w:r>
         <w:rPr>
@@ -119,7 +119,7 @@
     </w:p>
     <w:p>
       <w:r>
-        <w:t xml:space="preserve">{#temSegundaLoja}SEGUNDA UNIDADE: O presente contrato abrange também a 2ª unidade da CONTRATANTE, {nome_cliente_2}, pessoa jurídica de direito privado, inscrita no CNPJ nº {cnpj_cliente_2}, pela qual será devido {forma_pagamento_2}{/temSegundaLoja}</w:t>
+        <w:t xml:space="preserve">{#temSegundaLoja}SEGUNDA UNIDADE: O presente contrato abrange também a 2ª unidade da CONTRATANTE, {nome_cliente_2}, {qualif_cliente_2}, inscrita no {doc_tipo_2} nº {cnpj_cliente_2}, pela qual será devido {forma_pagamento_2}{/temSegundaLoja}</w:t>
       </w:r>
     </w:p>
     <w:p>

</xml_diff>